<commit_message>
Marcius Melhem: revisão da Parte 2
Co-Authored-By: Claude Opus 5.5 <noreply@anthropic.com>
Claude-Session: https://claude.ai/code/session_01MJjUEEZrxQDEUifKK2vj9g
</commit_message>
<xml_diff>
--- a/roteiros/marcius-melhem/Melhem_Parte2.docx
+++ b/roteiros/marcius-melhem/Melhem_Parte2.docx
@@ -71,7 +71,7 @@
         <w:rPr>
           <w:color w:val="000000"/>
         </w:rPr>
-        <w:t>Os dois anunciaram a separação em abril de dois mil e dezessete. Poucos meses antes daquela festa.</w:t>
+        <w:t>Os dois anunciaram a separação em abril de dois mil e dezessete. No mesmo ano daquela festa.</w:t>
       </w:r>
     </w:p>
     <w:p>
@@ -79,7 +79,7 @@
         <w:rPr>
           <w:color w:val="000000"/>
         </w:rPr>
-        <w:t>Pense na posição dessa mulher. Recém-separada, trabalhando num programa comandado por um homem que era parceiro de trabalho do ex-marido dela. Dentro de um departamento onde esse mesmo homem tinha cada vez mais poder.</w:t>
+        <w:t>Pense na posição dessa mulher. Em meio a uma separação, trabalhando num programa comandado por um homem que era parceiro de trabalho do ex-marido dela. Dentro de um departamento onde esse mesmo homem tinha cada vez mais poder.</w:t>
       </w:r>
     </w:p>
     <w:p>
@@ -87,7 +87,7 @@
         <w:rPr>
           <w:color w:val="C00000"/>
         </w:rPr>
-        <w:t>Guarde esse detalhe. Porque, quando a história finalmente veio à tona, uma das vozes que mais cobraram uma resposta da Globo foi justamente a de Marcelo Adnet. O homem que dividia o palco com Melhem.</w:t>
+        <w:t>Guarde esse detalhe. Porque, quando a história finalmente veio à tona, uma das vozes que cobraram uma resposta da Globo foi justamente a de Marcelo Adnet. O homem que dividia o palco com Melhem.</w:t>
       </w:r>
     </w:p>
     <w:p>
@@ -135,7 +135,7 @@
         <w:rPr>
           <w:color w:val="000000"/>
         </w:rPr>
-        <w:t>Ela continuou no elenco. Continuou gravando. Continuou sorrindo nas cenas.</w:t>
+        <w:t>Ela continuou no elenco, gravando os quadros toda semana como se nada tivesse acontecido.</w:t>
       </w:r>
     </w:p>
     <w:p>
@@ -199,7 +199,7 @@
         <w:rPr>
           <w:color w:val="000000"/>
         </w:rPr>
-        <w:t>Uma das filhas dele, gêmea, estava doente. Precisava de uma cirurgia, e o tratamento ia ser feito fora do país, nos Estados Unidos.</w:t>
+        <w:t>Uma das filhas gêmeas dele estava doente. Precisava de uma cirurgia, e o tratamento ia ser feito fora do país, nos Estados Unidos.</w:t>
       </w:r>
     </w:p>
     <w:p>
@@ -239,7 +239,7 @@
         <w:rPr>
           <w:color w:val="000000"/>
         </w:rPr>
-        <w:t>Imagine a cena do lado de fora. Um dos homens mais conhecidos do humor brasileiro, longe dos estúdios, num hospital em outro país, ao lado de uma filha pequena. Era uma imagem que despertava compaixão em qualquer pessoa.</w:t>
+        <w:t>Imagine a cena do lado de fora. Um dos homens mais conhecidos do humor brasileiro, longe dos estúdios, acompanhando o tratamento de uma filha em outro país. Era uma imagem que despertava compaixão em qualquer pessoa.</w:t>
       </w:r>
     </w:p>
     <w:p>
@@ -247,7 +247,7 @@
         <w:rPr>
           <w:color w:val="000000"/>
         </w:rPr>
-        <w:t>No mesmo mês, o mundo parou. A pandemia chegou ao Brasil, as gravações da Globo foram suspensas, e os estúdios ficaram vazios. As novelas saíram do ar. Os humorísticos também.</w:t>
+        <w:t>No mesmo mês, o mundo parou. A pandemia chegou ao Brasil, as gravações da Globo foram suspensas, e os estúdios ficaram vazios. As novelas inéditas saíram do ar.</w:t>
       </w:r>
     </w:p>
     <w:p>
@@ -303,7 +303,7 @@
         <w:rPr>
           <w:color w:val="C00000"/>
         </w:rPr>
-        <w:t>Lembre dessa nota, e da primeira, a de março. Porque, meses depois, colegas de Melhem iam dizer em público que ela tinha deixado de fora a parte mais importante da história. E o que estava escondido entre aquelas poucas linhas ia explodir de um jeito que a Globo não conseguiu controlar.</w:t>
+        <w:t>Lembre dessa nota, e da primeira, a de março. Porque, meses depois, colegas de Melhem iam apontar que ela tinha deixado de fora a parte mais importante da história. E o que estava escondido entre aquelas poucas linhas ia explodir de um jeito que a Globo não conseguiu controlar.</w:t>
       </w:r>
     </w:p>
     <w:p>
@@ -439,7 +439,7 @@
         <w:rPr>
           <w:color w:val="000000"/>
         </w:rPr>
-        <w:t>Entre eles estavam nomes conhecidos do público. Marcelo Adnet. Eduardo Sterblitch. João Vicente de Castro.</w:t>
+        <w:t>Entre eles estavam nomes conhecidos do público, como Marcelo Adnet e Eduardo Sterblitch.</w:t>
       </w:r>
     </w:p>
     <w:p>
@@ -447,15 +447,7 @@
         <w:rPr>
           <w:color w:val="000000"/>
         </w:rPr>
-        <w:t>Eles queriam saber por que a nota de saída não dizia uma palavra sobre o que tinha acontecido.</w:t>
-      </w:r>
-    </w:p>
-    <w:p>
-      <w:r>
-        <w:rPr>
-          <w:color w:val="000000"/>
-        </w:rPr>
-        <w:t>Nenhuma das duas notas da Globo, a de março e a de agosto, tinha mencionado qualquer acusação.</w:t>
+        <w:t>Eles queriam saber por que nenhuma das duas notas da Globo, nem a de março nem a de agosto, dizia uma palavra sobre as acusações.</w:t>
       </w:r>
     </w:p>
     <w:p>

</xml_diff>

<commit_message>
Marcius Melhem: Parte 2
Co-Authored-By: Claude Opus 5.5 <noreply@anthropic.com>
Claude-Session: https://claude.ai/code/session_01MJjUEEZrxQDEUifKK2vj9g
</commit_message>
<xml_diff>
--- a/roteiros/marcius-melhem/Melhem_Parte2.docx
+++ b/roteiros/marcius-melhem/Melhem_Parte2.docx
@@ -7,7 +7,7 @@
         <w:pStyle w:val="Heading1"/>
       </w:pPr>
       <w:r>
-        <w:t>Assim FOI a VIDA de MARCIUS MELHEM: O Escândalo Que A Globo Não Conseguiu Abafar — Parte 2</w:t>
+        <w:t>MARCIUS MELHEM: O Escândalo Que a Globo Nunca Explicou — Parte 2</w:t>
       </w:r>
     </w:p>
     <w:p>
@@ -15,7 +15,7 @@
         <w:rPr>
           <w:color w:val="000000"/>
         </w:rPr>
-        <w:t>Para entender o peso daquela noite, é preciso conhecer melhor a mulher que estava no centro dela.</w:t>
+        <w:t>Dois mil e catorze.</w:t>
       </w:r>
     </w:p>
     <w:p>
@@ -23,7 +23,7 @@
         <w:rPr>
           <w:color w:val="000000"/>
         </w:rPr>
-        <w:t>Dani Calabresa já tinha estrada no humor quando chegou à Globo.</w:t>
+        <w:t>A Globo estreou um programa de humor diferente de tudo o que tinha feito até ali.</w:t>
       </w:r>
     </w:p>
     <w:p>
@@ -31,7 +31,7 @@
         <w:rPr>
           <w:color w:val="000000"/>
         </w:rPr>
-        <w:t>Ela tinha ficado conhecida na MTV, apresentando um programa de humor chamado Furo MTV. Depois, em dois mil e treze, foi para a Band, no CQC, um dos programas mais assistidos pelos jovens daquela época.</w:t>
+        <w:t>Chamava-se Tá no Ar: a TV na TV.</w:t>
       </w:r>
     </w:p>
     <w:p>
@@ -39,7 +39,7 @@
         <w:rPr>
           <w:color w:val="000000"/>
         </w:rPr>
-        <w:t>Na Globo, ela chegou ao elenco do Zorra como uma das comediantes mais conhecidas do grupo.</w:t>
+        <w:t>A ideia era fazer piada com a própria televisão. Comerciais falsos e telejornais absurdos, tudo misturado como se o espectador estivesse zapeando os canais.</w:t>
       </w:r>
     </w:p>
     <w:p>
@@ -47,7 +47,7 @@
         <w:rPr>
           <w:color w:val="000000"/>
         </w:rPr>
-        <w:t>E o Zorra daquela época era uma vitrine valiosa. Em dois mil e dezesseis, a primeira temporada do programa reformulado chegou a concorrer ao Emmy Internacional, na categoria de comédia. Estar naquele elenco era estar no lugar mais prestigiado do humor da Globo.</w:t>
+        <w:t>À frente do programa estavam Marcelo Adnet, um dos humoristas mais talentosos da nova geração, e Marcius Melhem.</w:t>
       </w:r>
     </w:p>
     <w:p>
@@ -55,7 +55,7 @@
         <w:rPr>
           <w:color w:val="000000"/>
         </w:rPr>
-        <w:t>E havia um detalhe que tornava tudo ainda mais delicado.</w:t>
+        <w:t>Os dois escreveram e atuaram juntos.</w:t>
       </w:r>
     </w:p>
     <w:p>
@@ -63,7 +63,7 @@
         <w:rPr>
           <w:color w:val="000000"/>
         </w:rPr>
-        <w:t>Durante sete anos, Dani tinha sido casada com Marcelo Adnet. O mesmo Marcelo Adnet que criou o Tá no Ar ao lado de Marcius Melhem.</w:t>
+        <w:t>Tá no Ar virou sucesso de público e de crítica. Era o humor inteligente que muita gente dizia que a televisão aberta tinha esquecido como fazer.</w:t>
       </w:r>
     </w:p>
     <w:p>
@@ -71,7 +71,7 @@
         <w:rPr>
           <w:color w:val="000000"/>
         </w:rPr>
-        <w:t>Os dois anunciaram a separação em abril de dois mil e dezessete. No mesmo ano daquela festa.</w:t>
+        <w:t>E o reconhecimento veio de fora do país.</w:t>
       </w:r>
     </w:p>
     <w:p>
@@ -79,7 +79,15 @@
         <w:rPr>
           <w:color w:val="000000"/>
         </w:rPr>
-        <w:t>Pense na posição dessa mulher. Em meio a uma separação, trabalhando num programa comandado por um homem que era parceiro de trabalho do ex-marido dela. Dentro de um departamento onde esse mesmo homem tinha cada vez mais poder.</w:t>
+        <w:t>Em dois mil e dezesseis e em dois mil e dezessete, Melhem recebeu indicações ao Emmy Internacional, o prêmio mais importante da televisão mundial.</w:t>
+      </w:r>
+    </w:p>
+    <w:p>
+      <w:r>
+        <w:rPr>
+          <w:color w:val="000000"/>
+        </w:rPr>
+        <w:t>O jornalista que tinha entrado numa aula de teatro por acaso estava sendo reconhecido no mundo inteiro.</w:t>
       </w:r>
     </w:p>
     <w:p>
@@ -87,7 +95,7 @@
         <w:rPr>
           <w:color w:val="C00000"/>
         </w:rPr>
-        <w:t>Guarde esse detalhe. Porque, quando a história finalmente veio à tona, uma das vozes que cobraram uma resposta da Globo foi justamente a de Marcelo Adnet. O homem que dividia o palco com Melhem.</w:t>
+        <w:t>Guarde o nome de Marcelo Adnet. Porque o parceiro que dividiu com Melhem o maior sucesso da carreira dele ia ter um papel muito diferente nesta história, anos depois. E a posição que ele tomou ia surpreender muita gente.</w:t>
       </w:r>
     </w:p>
     <w:p>
@@ -95,7 +103,7 @@
         <w:rPr>
           <w:color w:val="000000"/>
         </w:rPr>
-        <w:t>Depois daquela festa, a vida no Zorra seguiu, pelo menos do lado de fora.</w:t>
+        <w:t>Ao mesmo tempo, a Globo decidiu reformular um dos programas mais antigos da casa.</w:t>
       </w:r>
     </w:p>
     <w:p>
@@ -103,7 +111,7 @@
         <w:rPr>
           <w:color w:val="000000"/>
         </w:rPr>
-        <w:t>O programa continuou no ar. Os quadros continuaram sendo gravados. E, para o público, nada tinha acontecido.</w:t>
+        <w:t>O velho Zorra Total, aquele das noites de sábado, ganhou uma cara nova. Passou a se chamar apenas Zorra. Um humor mais moderno, com um elenco renovado.</w:t>
       </w:r>
     </w:p>
     <w:p>
@@ -111,7 +119,7 @@
         <w:rPr>
           <w:color w:val="000000"/>
         </w:rPr>
-        <w:t>Marcius Melhem continuou subindo.</w:t>
+        <w:t>Quem passou a comandar o novo Zorra foi Marcius Melhem.</w:t>
       </w:r>
     </w:p>
     <w:p>
@@ -119,7 +127,7 @@
         <w:rPr>
           <w:color w:val="000000"/>
         </w:rPr>
-        <w:t>Em dois mil e dezoito, como você já viu, ele assumiu o comando de todo o departamento de humor da emissora.</w:t>
+        <w:t>No elenco, havia vários humoristas talentosos. Entre eles, uma comediante que já era conhecida do público por programas de humor em outras emissoras.</w:t>
       </w:r>
     </w:p>
     <w:p>
@@ -127,7 +135,7 @@
         <w:rPr>
           <w:color w:val="000000"/>
         </w:rPr>
-        <w:t>Dani Calabresa, enquanto isso, carregava em silêncio o que tinha vivido naquela noite.</w:t>
+        <w:t>O nome dela era Dani Calabresa.</w:t>
       </w:r>
     </w:p>
     <w:p>
@@ -135,7 +143,7 @@
         <w:rPr>
           <w:color w:val="000000"/>
         </w:rPr>
-        <w:t>Ela continuou no elenco, gravando os quadros toda semana como se nada tivesse acontecido.</w:t>
+        <w:t>Durante alguns anos, os dois trabalharam juntos. Ele, o diretor. Ela, uma das estrelas do elenco.</w:t>
       </w:r>
     </w:p>
     <w:p>
@@ -143,7 +151,15 @@
         <w:rPr>
           <w:color w:val="000000"/>
         </w:rPr>
-        <w:t>Segundo a reportagem que viria a público anos depois, ela só teve coragem de levar o caso adiante quando já estava fora do Zorra e longe do Brasil. Ela tinha se mudado para os Estados Unidos.</w:t>
+        <w:t>Para quem via de fora, era só mais uma equipe de humor fazendo o Brasil rir nas noites de sábado.</w:t>
+      </w:r>
+    </w:p>
+    <w:p>
+      <w:r>
+        <w:rPr>
+          <w:color w:val="C00000"/>
+        </w:rPr>
+        <w:t>Mas guarde o nome de Dani Calabresa com atenção. Porque, segundo relatos que só viriam a público anos depois, o que aconteceu entre ela e o diretor do programa, longe das câmeras, ia mudar para sempre a vida dos dois. E ia virar um dos escândalos mais comentados da história recente da Globo.</w:t>
       </w:r>
     </w:p>
     <w:p>
@@ -151,7 +167,7 @@
         <w:rPr>
           <w:color w:val="000000"/>
         </w:rPr>
-        <w:t>Foi de lá que ela fez uma ligação.</w:t>
+        <w:t>A carreira de Melhem continuava subindo.</w:t>
       </w:r>
     </w:p>
     <w:p>
@@ -159,7 +175,7 @@
         <w:rPr>
           <w:color w:val="000000"/>
         </w:rPr>
-        <w:t>Era vinte e dois de dezembro, a poucos dias do Natal.</w:t>
+        <w:t>Além do Zorra e do Tá no Ar, ele passou a responder por outros projetos de humor da emissora. Programas como Fora de Hora. Quadros no Fantástico, como Isso a Globo Não Mostra.</w:t>
       </w:r>
     </w:p>
     <w:p>
@@ -167,7 +183,7 @@
         <w:rPr>
           <w:color w:val="000000"/>
         </w:rPr>
-        <w:t>Do outro lado da linha estava Mônica Albuquerque, a executiva que comandava a área de desenvolvimento e acompanhamento artístico da Globo. Na prática, a pessoa responsável por cuidar dos artistas da emissora.</w:t>
+        <w:t>Até que, em dois mil e dezoito, veio o cargo mais alto.</w:t>
       </w:r>
     </w:p>
     <w:p>
@@ -175,7 +191,47 @@
         <w:rPr>
           <w:color w:val="000000"/>
         </w:rPr>
-        <w:t>As duas marcaram uma reunião para o dia dois de janeiro.</w:t>
+        <w:t>Marcius Melhem foi nomeado o responsável por toda a área de humor da Globo.</w:t>
+      </w:r>
+    </w:p>
+    <w:p>
+      <w:r>
+        <w:rPr>
+          <w:color w:val="000000"/>
+        </w:rPr>
+        <w:t>Pense no tamanho desse poder.</w:t>
+      </w:r>
+    </w:p>
+    <w:p>
+      <w:r>
+        <w:rPr>
+          <w:color w:val="000000"/>
+        </w:rPr>
+        <w:t>A Globo era, de longe, a maior emissora de televisão do país. E o humor era uma das áreas mais disputadas da casa. Quem queria um programa, um quadro, um personagem, um lugar no elenco, passava pelas decisões de um homem.</w:t>
+      </w:r>
+    </w:p>
+    <w:p>
+      <w:r>
+        <w:rPr>
+          <w:color w:val="000000"/>
+        </w:rPr>
+        <w:t>Marcius Melhem.</w:t>
+      </w:r>
+    </w:p>
+    <w:p>
+      <w:r>
+        <w:rPr>
+          <w:color w:val="000000"/>
+        </w:rPr>
+        <w:t>Ele decidia quem ganhava espaço no ar e quem ficava de fora.</w:t>
+      </w:r>
+    </w:p>
+    <w:p>
+      <w:r>
+        <w:rPr>
+          <w:color w:val="000000"/>
+        </w:rPr>
+        <w:t>Para quem estava começando a carreira, ou para quem dependia daquele emprego, aquele homem tinha nas mãos o futuro profissional de muita gente.</w:t>
       </w:r>
     </w:p>
     <w:p>
@@ -183,7 +239,7 @@
         <w:rPr>
           <w:color w:val="C00000"/>
         </w:rPr>
-        <w:t>Imagine o que significa fazer essa ligação. Denunciar o chefe do humor da maior emissora do país, sabendo que ele tinha o poder de decidir o seu futuro na televisão. E o que a Globo decidiu fazer depois daquela conversa é uma das partes mais revoltantes dessa história.</w:t>
+        <w:t>Pense por um segundo em como seria trabalhar para alguém assim. Alguém que pode decidir, sozinho, se o seu trabalho vai ao ar ou se vai para a gaveta. E agora imagine ter que contar alguma coisa contra essa pessoa. Para quem você contaria?</w:t>
       </w:r>
     </w:p>
     <w:p>
@@ -191,7 +247,7 @@
         <w:rPr>
           <w:color w:val="000000"/>
         </w:rPr>
-        <w:t>Enquanto essa conversa acontecia longe dos holofotes, a vida de Marcius Melhem também estava mudando.</w:t>
+        <w:t>Tudo parecia estar no auge.</w:t>
       </w:r>
     </w:p>
     <w:p>
@@ -199,7 +255,7 @@
         <w:rPr>
           <w:color w:val="000000"/>
         </w:rPr>
-        <w:t>Uma das filhas gêmeas dele estava doente. Precisava de uma cirurgia, e o tratamento ia ser feito fora do país, nos Estados Unidos.</w:t>
+        <w:t>Até que, entre o fim de dois mil e dezenove e o começo de dois mil e vinte, Marcius Melhem se afastou.</w:t>
       </w:r>
     </w:p>
     <w:p>
@@ -207,7 +263,7 @@
         <w:rPr>
           <w:color w:val="000000"/>
         </w:rPr>
-        <w:t>No dia seis de março de dois mil e vinte, a Globo divulgou uma primeira nota. Dizia que Marcius Melhem estava se afastando dos projetos de humor por motivos pessoais.</w:t>
+        <w:t>A explicação oficial era pessoal. Uma das filhas dele precisava de cuidados graves de saúde, e ele precisava estar ao lado dela.</w:t>
       </w:r>
     </w:p>
     <w:p>
@@ -215,7 +271,7 @@
         <w:rPr>
           <w:color w:val="000000"/>
         </w:rPr>
-        <w:t>Ele pediu licença para acompanhar o tratamento da filha no exterior.</w:t>
+        <w:t>Publicamente, ninguém questionou. Era uma situação delicada, e o afastamento parecia temporário.</w:t>
       </w:r>
     </w:p>
     <w:p>
@@ -223,7 +279,7 @@
         <w:rPr>
           <w:color w:val="000000"/>
         </w:rPr>
-        <w:t>Ninguém de fora sabia de nenhuma denúncia. Para o público, era só um pai deixando o trabalho para cuidar de uma criança doente.</w:t>
+        <w:t>Os meses foram passando.</w:t>
       </w:r>
     </w:p>
     <w:p>
@@ -231,7 +287,7 @@
         <w:rPr>
           <w:color w:val="000000"/>
         </w:rPr>
-        <w:t>Muita gente se solidarizou.</w:t>
+        <w:t>E, nos bastidores da Globo, alguma coisa estava acontecendo.</w:t>
       </w:r>
     </w:p>
     <w:p>
@@ -239,7 +295,7 @@
         <w:rPr>
           <w:color w:val="000000"/>
         </w:rPr>
-        <w:t>Imagine a cena do lado de fora. Um dos homens mais conhecidos do humor brasileiro, longe dos estúdios, acompanhando o tratamento de uma filha em outro país. Era uma imagem que despertava compaixão em qualquer pessoa.</w:t>
+        <w:t>Catorze de agosto de dois mil e vinte.</w:t>
       </w:r>
     </w:p>
     <w:p>
@@ -247,7 +303,7 @@
         <w:rPr>
           <w:color w:val="000000"/>
         </w:rPr>
-        <w:t>No mesmo mês, o mundo parou. A pandemia chegou ao Brasil, as gravações da Globo foram suspensas, e os estúdios ficaram vazios. As novelas inéditas saíram do ar.</w:t>
+        <w:t>Em plena pandemia, a Globo anunciou que o contrato de Marcius Melhem tinha chegado ao fim. Depois de dezessete anos.</w:t>
       </w:r>
     </w:p>
     <w:p>
@@ -255,7 +311,7 @@
         <w:rPr>
           <w:color w:val="000000"/>
         </w:rPr>
-        <w:t>Durante meses, quase ninguém falou de Marcius Melhem.</w:t>
+        <w:t>O comunicado dizia que a parceria tinha sido encerrada em comum acordo.</w:t>
       </w:r>
     </w:p>
     <w:p>
@@ -263,7 +319,7 @@
         <w:rPr>
           <w:color w:val="000000"/>
         </w:rPr>
-        <w:t>Até o dia catorze de agosto de dois mil e vinte.</w:t>
+        <w:t>Mais nada.</w:t>
       </w:r>
     </w:p>
     <w:p>
@@ -271,7 +327,7 @@
         <w:rPr>
           <w:color w:val="000000"/>
         </w:rPr>
-        <w:t>Naquela sexta-feira, a Globo divulgou uma nota curta. Poucas linhas.</w:t>
+        <w:t>Nenhuma palavra sobre o motivo. Nenhuma menção a qualquer problema. Apenas o fim de uma das parcerias mais longas do humor da emissora.</w:t>
       </w:r>
     </w:p>
     <w:p>
@@ -279,7 +335,7 @@
         <w:rPr>
           <w:color w:val="000000"/>
         </w:rPr>
-        <w:t>A nota dizia que a Globo e Marcius Melhem, em comum acordo, estavam encerrando uma parceria de dezessete anos de sucessos.</w:t>
+        <w:t>Para o público, era só mais uma saída. Profissionais deixam emissoras o tempo todo.</w:t>
       </w:r>
     </w:p>
     <w:p>
@@ -287,15 +343,7 @@
         <w:rPr>
           <w:color w:val="000000"/>
         </w:rPr>
-        <w:t>Era só isso.</w:t>
-      </w:r>
-    </w:p>
-    <w:p>
-      <w:r>
-        <w:rPr>
-          <w:color w:val="000000"/>
-        </w:rPr>
-        <w:t>Nenhuma palavra sobre denúncia. Nenhuma explicação sobre o motivo. O comando do humor passou para as mãos de Silvio de Abreu, um dos autores de novela mais experientes da casa.</w:t>
+        <w:t>Só que, segundo a reportagem que viria depois, dentro da Globo muita gente sabia que aquele comunicado não contava a história inteira.</w:t>
       </w:r>
     </w:p>
     <w:p>
@@ -303,159 +351,7 @@
         <w:rPr>
           <w:color w:val="C00000"/>
         </w:rPr>
-        <w:t>Lembre dessa nota, e da primeira, a de março. Porque, meses depois, colegas de Melhem iam apontar que ela tinha deixado de fora a parte mais importante da história. E o que estava escondido entre aquelas poucas linhas ia explodir de um jeito que a Globo não conseguiu controlar.</w:t>
-      </w:r>
-    </w:p>
-    <w:p>
-      <w:r>
-        <w:rPr>
-          <w:color w:val="000000"/>
-        </w:rPr>
-        <w:t>No mesmo dia, começaram a circular boatos.</w:t>
-      </w:r>
-    </w:p>
-    <w:p>
-      <w:r>
-        <w:rPr>
-          <w:color w:val="000000"/>
-        </w:rPr>
-        <w:t>Alguns colunistas falavam em reclamações de assédio moral dentro do departamento de humor. Humoristas que teriam se queixado do tratamento recebido do chefe. Alguns dos nomes citados na época negaram ter feito qualquer denúncia.</w:t>
-      </w:r>
-    </w:p>
-    <w:p>
-      <w:r>
-        <w:rPr>
-          <w:color w:val="000000"/>
-        </w:rPr>
-        <w:t>Melhem também falou. Disse que a saída tinha a ver com a família, com o momento difícil que estava vivendo por causa da filha. E negou que tivesse cometido qualquer assédio.</w:t>
-      </w:r>
-    </w:p>
-    <w:p>
-      <w:r>
-        <w:rPr>
-          <w:color w:val="000000"/>
-        </w:rPr>
-        <w:t>Para muita gente, a história parecia encerrada ali. Um diretor importante deixava a emissora, os boatos iam esfriando, e a vida seguia.</w:t>
-      </w:r>
-    </w:p>
-    <w:p>
-      <w:r>
-        <w:rPr>
-          <w:color w:val="000000"/>
-        </w:rPr>
-        <w:t>Até outubro.</w:t>
-      </w:r>
-    </w:p>
-    <w:p>
-      <w:r>
-        <w:rPr>
-          <w:color w:val="000000"/>
-        </w:rPr>
-        <w:t>Em outubro de dois mil e vinte, uma advogada chamada Mayra Cotta deu uma entrevista à Folha de S.Paulo, um dos maiores jornais do país.</w:t>
-      </w:r>
-    </w:p>
-    <w:p>
-      <w:r>
-        <w:rPr>
-          <w:color w:val="000000"/>
-        </w:rPr>
-        <w:t>Ela representava mulheres que acusavam Marcius Melhem. E o que ela disse naquela entrevista mudou o tom de tudo.</w:t>
-      </w:r>
-    </w:p>
-    <w:p>
-      <w:r>
-        <w:rPr>
-          <w:color w:val="000000"/>
-        </w:rPr>
-        <w:t>Segundo a advogada, as denúncias que tinham chegado à Globo eram de assédio sexual. E ela descreveu um homem que, de acordo com as clientes dela, usava a posição de chefe para constranger as mulheres que trabalhavam com ele. Segundo ela, em algumas situações, as mulheres chegaram a ficar trancadas em salas com ele.</w:t>
-      </w:r>
-    </w:p>
-    <w:p>
-      <w:r>
-        <w:rPr>
-          <w:color w:val="000000"/>
-        </w:rPr>
-        <w:t>Os nomes das mulheres não foram divulgados.</w:t>
-      </w:r>
-    </w:p>
-    <w:p>
-      <w:r>
-        <w:rPr>
-          <w:color w:val="000000"/>
-        </w:rPr>
-        <w:t>O que veio a público depois mostrou o tamanho do caso. Um inquérito com mais de duas mil e quatrocentas páginas, reunindo relatos de oito mulheres.</w:t>
-      </w:r>
-    </w:p>
-    <w:p>
-      <w:r>
-        <w:rPr>
-          <w:color w:val="C00000"/>
-        </w:rPr>
-        <w:t>Anote esse número. Duas mil e quatrocentas páginas. Porque, anos depois, esse calhamaço de papel ia passar pelas mãos de promotores e juízes. E o destino dele é uma das partes mais difíceis de aceitar dessa história.</w:t>
-      </w:r>
-    </w:p>
-    <w:p>
-      <w:r>
-        <w:rPr>
-          <w:color w:val="000000"/>
-        </w:rPr>
-        <w:t>Melhem respondeu pelas redes sociais.</w:t>
-      </w:r>
-    </w:p>
-    <w:p>
-      <w:r>
-        <w:rPr>
-          <w:color w:val="000000"/>
-        </w:rPr>
-        <w:t>Numa longa sequência de mensagens no Twitter, ele negou ter cometido assédio. Disse que, se tivesse errado com alguém em algum momento, estava disposto a reconhecer e, se possível, reparar. Mas rejeitou a acusação de assédio sexual.</w:t>
-      </w:r>
-    </w:p>
-    <w:p>
-      <w:r>
-        <w:rPr>
-          <w:color w:val="000000"/>
-        </w:rPr>
-        <w:t>Naquele momento, o público ainda não sabia quem eram as mulheres. Nem o que exatamente cada uma tinha contado.</w:t>
-      </w:r>
-    </w:p>
-    <w:p>
-      <w:r>
-        <w:rPr>
-          <w:color w:val="000000"/>
-        </w:rPr>
-        <w:t>Só que, por trás das câmeras, a história estava longe de terminar.</w:t>
-      </w:r>
-    </w:p>
-    <w:p>
-      <w:r>
-        <w:rPr>
-          <w:color w:val="000000"/>
-        </w:rPr>
-        <w:t>Colegas de Melhem, atores que trabalhavam no humor da Globo, estavam incomodados. Alguns deles cobravam da emissora uma posição mais firme.</w:t>
-      </w:r>
-    </w:p>
-    <w:p>
-      <w:r>
-        <w:rPr>
-          <w:color w:val="000000"/>
-        </w:rPr>
-        <w:t>Entre eles estavam nomes conhecidos do público, como Marcelo Adnet e Eduardo Sterblitch.</w:t>
-      </w:r>
-    </w:p>
-    <w:p>
-      <w:r>
-        <w:rPr>
-          <w:color w:val="000000"/>
-        </w:rPr>
-        <w:t>Eles queriam saber por que nenhuma das duas notas da Globo, nem a de março nem a de agosto, dizia uma palavra sobre as acusações.</w:t>
-      </w:r>
-    </w:p>
-    <w:p>
-      <w:r>
-        <w:rPr>
-          <w:color w:val="C00000"/>
-        </w:rPr>
-        <w:t>E enquanto a versão oficial continuava em silêncio, um repórter estava ouvindo, uma por uma, as pessoas que tinham trabalhado perto de Marcius Melhem. Quarenta e três pessoas. O que ele descobriu ia transformar aquela saída silenciosa num escândalo que nenhuma nota conseguiria conter.</w:t>
+        <w:t>Porque, quatro meses depois, uma revista ia publicar uma reportagem com mais de quarenta entrevistas. E o que estava escrito ali fez o Brasil inteiro perguntar a mesma coisa. O que a Globo sabia, e desde quando?</w:t>
       </w:r>
     </w:p>
     <w:sectPr>

</xml_diff>